<commit_message>
Fix interim report: embed all 8 figures in DOCX, fix equation parser infinite loop, restore section 2.7, clean up intermediate files
Made-with: Cursor
</commit_message>
<xml_diff>
--- a/archive/interim_report/B01821011_Interim_Report_Final.docx
+++ b/archive/interim_report/B01821011_Interim_Report_Final.docx
@@ -219,10 +219,13 @@
         <w:pStyle w:val="Heading1"/>
       </w:pPr>
       <w:r>
-        <w:t>1. Summary Literature Review</w:t>
+        <w:t>List of Figures</w:t>
       </w:r>
     </w:p>
     <w:p>
+      <w:pPr>
+        <w:pStyle w:val="ListNumber"/>
+      </w:pPr>
       <w:r>
         <w:rPr>
           <w:rFonts w:ascii="Calibri" w:hAnsi="Calibri"/>
@@ -230,7 +233,446 @@
           <w:i w:val="0"/>
           <w:sz w:val="22"/>
         </w:rPr>
+      </w:r>
+      <w:r>
+        <w:rPr>
+          <w:rFonts w:ascii="Calibri" w:hAnsi="Calibri"/>
+          <w:b/>
+          <w:i w:val="0"/>
+          <w:sz w:val="22"/>
+        </w:rPr>
+        <w:t>Figure 1:</w:t>
+      </w:r>
+      <w:r>
+        <w:rPr>
+          <w:rFonts w:ascii="Calibri" w:hAnsi="Calibri"/>
+          <w:b w:val="0"/>
+          <w:i w:val="0"/>
+          <w:sz w:val="22"/>
+        </w:rPr>
+        <w:t xml:space="preserve"> Taxonomy of IDS approaches relevant to IoT and this project</w:t>
+      </w:r>
+    </w:p>
+    <w:p>
+      <w:pPr>
+        <w:pStyle w:val="ListNumber"/>
+      </w:pPr>
+      <w:r>
+        <w:rPr>
+          <w:rFonts w:ascii="Calibri" w:hAnsi="Calibri"/>
+          <w:b w:val="0"/>
+          <w:i w:val="0"/>
+          <w:sz w:val="22"/>
+        </w:rPr>
+      </w:r>
+      <w:r>
+        <w:rPr>
+          <w:rFonts w:ascii="Calibri" w:hAnsi="Calibri"/>
+          <w:b/>
+          <w:i w:val="0"/>
+          <w:sz w:val="22"/>
+        </w:rPr>
+        <w:t>Figure 2:</w:t>
+      </w:r>
+      <w:r>
+        <w:rPr>
+          <w:rFonts w:ascii="Calibri" w:hAnsi="Calibri"/>
+          <w:b w:val="0"/>
+          <w:i w:val="0"/>
+          <w:sz w:val="22"/>
+        </w:rPr>
+        <w:t xml:space="preserve"> Conceptual flow of a dynamic GNN (GAT + GRU)</w:t>
+      </w:r>
+    </w:p>
+    <w:p>
+      <w:pPr>
+        <w:pStyle w:val="ListNumber"/>
+      </w:pPr>
+      <w:r>
+        <w:rPr>
+          <w:rFonts w:ascii="Calibri" w:hAnsi="Calibri"/>
+          <w:b w:val="0"/>
+          <w:i w:val="0"/>
+          <w:sz w:val="22"/>
+        </w:rPr>
+      </w:r>
+      <w:r>
+        <w:rPr>
+          <w:rFonts w:ascii="Calibri" w:hAnsi="Calibri"/>
+          <w:b/>
+          <w:i w:val="0"/>
+          <w:sz w:val="22"/>
+        </w:rPr>
+        <w:t>Figure 3:</w:t>
+      </w:r>
+      <w:r>
+        <w:rPr>
+          <w:rFonts w:ascii="Calibri" w:hAnsi="Calibri"/>
+          <w:b w:val="0"/>
+          <w:i w:val="0"/>
+          <w:sz w:val="22"/>
+        </w:rPr>
+        <w:t xml:space="preserve"> Federated learning (FedAvg) flow</w:t>
+      </w:r>
+    </w:p>
+    <w:p>
+      <w:pPr>
+        <w:pStyle w:val="ListNumber"/>
+      </w:pPr>
+      <w:r>
+        <w:rPr>
+          <w:rFonts w:ascii="Calibri" w:hAnsi="Calibri"/>
+          <w:b w:val="0"/>
+          <w:i w:val="0"/>
+          <w:sz w:val="22"/>
+        </w:rPr>
+      </w:r>
+      <w:r>
+        <w:rPr>
+          <w:rFonts w:ascii="Calibri" w:hAnsi="Calibri"/>
+          <w:b/>
+          <w:i w:val="0"/>
+          <w:sz w:val="22"/>
+        </w:rPr>
+        <w:t>Figure 4:</w:t>
+      </w:r>
+      <w:r>
+        <w:rPr>
+          <w:rFonts w:ascii="Calibri" w:hAnsi="Calibri"/>
+          <w:b w:val="0"/>
+          <w:i w:val="0"/>
+          <w:sz w:val="22"/>
+        </w:rPr>
+        <w:t xml:space="preserve"> Explainability pipeline for SOC alerts</w:t>
+      </w:r>
+    </w:p>
+    <w:p>
+      <w:pPr>
+        <w:pStyle w:val="ListNumber"/>
+      </w:pPr>
+      <w:r>
+        <w:rPr>
+          <w:rFonts w:ascii="Calibri" w:hAnsi="Calibri"/>
+          <w:b w:val="0"/>
+          <w:i w:val="0"/>
+          <w:sz w:val="22"/>
+        </w:rPr>
+      </w:r>
+      <w:r>
+        <w:rPr>
+          <w:rFonts w:ascii="Calibri" w:hAnsi="Calibri"/>
+          <w:b/>
+          <w:i w:val="0"/>
+          <w:sz w:val="22"/>
+        </w:rPr>
+        <w:t>Figure 5:</w:t>
+      </w:r>
+      <w:r>
+        <w:rPr>
+          <w:rFonts w:ascii="Calibri" w:hAnsi="Calibri"/>
+          <w:b w:val="0"/>
+          <w:i w:val="0"/>
+          <w:sz w:val="22"/>
+        </w:rPr>
+        <w:t xml:space="preserve"> Positioning of related work (GNN, FL, explainability, SIEM)</w:t>
+      </w:r>
+    </w:p>
+    <w:p>
+      <w:pPr>
+        <w:pStyle w:val="ListNumber"/>
+      </w:pPr>
+      <w:r>
+        <w:rPr>
+          <w:rFonts w:ascii="Calibri" w:hAnsi="Calibri"/>
+          <w:b w:val="0"/>
+          <w:i w:val="0"/>
+          <w:sz w:val="22"/>
+        </w:rPr>
+      </w:r>
+      <w:r>
+        <w:rPr>
+          <w:rFonts w:ascii="Calibri" w:hAnsi="Calibri"/>
+          <w:b/>
+          <w:i w:val="0"/>
+          <w:sz w:val="22"/>
+        </w:rPr>
+        <w:t>Figure 6:</w:t>
+      </w:r>
+      <w:r>
+        <w:rPr>
+          <w:rFonts w:ascii="Calibri" w:hAnsi="Calibri"/>
+          <w:b w:val="0"/>
+          <w:i w:val="0"/>
+          <w:sz w:val="22"/>
+        </w:rPr>
+        <w:t xml:space="preserve"> Project integration of four literature pillars</w:t>
+      </w:r>
+    </w:p>
+    <w:p>
+      <w:pPr>
+        <w:pStyle w:val="ListNumber"/>
+      </w:pPr>
+      <w:r>
+        <w:rPr>
+          <w:rFonts w:ascii="Calibri" w:hAnsi="Calibri"/>
+          <w:b w:val="0"/>
+          <w:i w:val="0"/>
+          <w:sz w:val="22"/>
+        </w:rPr>
+      </w:r>
+      <w:r>
+        <w:rPr>
+          <w:rFonts w:ascii="Calibri" w:hAnsi="Calibri"/>
+          <w:b/>
+          <w:i w:val="0"/>
+          <w:sz w:val="22"/>
+        </w:rPr>
+        <w:t>Figure 7:</w:t>
+      </w:r>
+      <w:r>
+        <w:rPr>
+          <w:rFonts w:ascii="Calibri" w:hAnsi="Calibri"/>
+          <w:b w:val="0"/>
+          <w:i w:val="0"/>
+          <w:sz w:val="22"/>
+        </w:rPr>
+        <w:t xml:space="preserve"> End-to-end research pipeline aligned with literature findings</w:t>
+      </w:r>
+    </w:p>
+    <w:p>
+      <w:pPr>
+        <w:pStyle w:val="ListNumber"/>
+      </w:pPr>
+      <w:r>
+        <w:rPr>
+          <w:rFonts w:ascii="Calibri" w:hAnsi="Calibri"/>
+          <w:b w:val="0"/>
+          <w:i w:val="0"/>
+          <w:sz w:val="22"/>
+        </w:rPr>
+      </w:r>
+      <w:r>
+        <w:rPr>
+          <w:rFonts w:ascii="Calibri" w:hAnsi="Calibri"/>
+          <w:b/>
+          <w:i w:val="0"/>
+          <w:sz w:val="22"/>
+        </w:rPr>
+        <w:t>Figure 8:</w:t>
+      </w:r>
+      <w:r>
+        <w:rPr>
+          <w:rFonts w:ascii="Calibri" w:hAnsi="Calibri"/>
+          <w:b w:val="0"/>
+          <w:i w:val="0"/>
+          <w:sz w:val="22"/>
+        </w:rPr>
+        <w:t xml:space="preserve"> Interim-to-final completion roadmap</w:t>
+      </w:r>
+    </w:p>
+    <w:p>
+      <w:pPr>
+        <w:pStyle w:val="Heading1"/>
+      </w:pPr>
+      <w:r>
+        <w:t>List of Tables</w:t>
+      </w:r>
+    </w:p>
+    <w:p>
+      <w:pPr>
+        <w:pStyle w:val="ListNumber"/>
+      </w:pPr>
+      <w:r>
+        <w:rPr>
+          <w:rFonts w:ascii="Calibri" w:hAnsi="Calibri"/>
+          <w:b w:val="0"/>
+          <w:i w:val="0"/>
+          <w:sz w:val="22"/>
+        </w:rPr>
+      </w:r>
+      <w:r>
+        <w:rPr>
+          <w:rFonts w:ascii="Calibri" w:hAnsi="Calibri"/>
+          <w:b/>
+          <w:i w:val="0"/>
+          <w:sz w:val="22"/>
+        </w:rPr>
+        <w:t>Table 1:</w:t>
+      </w:r>
+      <w:r>
+        <w:rPr>
+          <w:rFonts w:ascii="Calibri" w:hAnsi="Calibri"/>
+          <w:b w:val="0"/>
+          <w:i w:val="0"/>
+          <w:sz w:val="22"/>
+        </w:rPr>
+        <w:t xml:space="preserve"> Comparison of related work against project pillars</w:t>
+      </w:r>
+    </w:p>
+    <w:p>
+      <w:pPr>
+        <w:pStyle w:val="ListNumber"/>
+      </w:pPr>
+      <w:r>
+        <w:rPr>
+          <w:rFonts w:ascii="Calibri" w:hAnsi="Calibri"/>
+          <w:b w:val="0"/>
+          <w:i w:val="0"/>
+          <w:sz w:val="22"/>
+        </w:rPr>
+      </w:r>
+      <w:r>
+        <w:rPr>
+          <w:rFonts w:ascii="Calibri" w:hAnsi="Calibri"/>
+          <w:b/>
+          <w:i w:val="0"/>
+          <w:sz w:val="22"/>
+        </w:rPr>
+        <w:t>Table 2:</w:t>
+      </w:r>
+      <w:r>
+        <w:rPr>
+          <w:rFonts w:ascii="Calibri" w:hAnsi="Calibri"/>
+          <w:b w:val="0"/>
+          <w:i w:val="0"/>
+          <w:sz w:val="22"/>
+        </w:rPr>
+        <w:t xml:space="preserve"> Summary of model architectures</w:t>
+      </w:r>
+    </w:p>
+    <w:p>
+      <w:pPr>
+        <w:pStyle w:val="ListNumber"/>
+      </w:pPr>
+      <w:r>
+        <w:rPr>
+          <w:rFonts w:ascii="Calibri" w:hAnsi="Calibri"/>
+          <w:b w:val="0"/>
+          <w:i w:val="0"/>
+          <w:sz w:val="22"/>
+        </w:rPr>
+      </w:r>
+      <w:r>
+        <w:rPr>
+          <w:rFonts w:ascii="Calibri" w:hAnsi="Calibri"/>
+          <w:b/>
+          <w:i w:val="0"/>
+          <w:sz w:val="22"/>
+        </w:rPr>
+        <w:t>Table 3:</w:t>
+      </w:r>
+      <w:r>
+        <w:rPr>
+          <w:rFonts w:ascii="Calibri" w:hAnsi="Calibri"/>
+          <w:b w:val="0"/>
+          <w:i w:val="0"/>
+          <w:sz w:val="22"/>
+        </w:rPr>
+        <w:t xml:space="preserve"> Completion timeline</w:t>
+      </w:r>
+    </w:p>
+    <w:p>
+      <w:pPr>
+        <w:pStyle w:val="ListNumber"/>
+      </w:pPr>
+      <w:r>
+        <w:rPr>
+          <w:rFonts w:ascii="Calibri" w:hAnsi="Calibri"/>
+          <w:b w:val="0"/>
+          <w:i w:val="0"/>
+          <w:sz w:val="22"/>
+        </w:rPr>
+      </w:r>
+      <w:r>
+        <w:rPr>
+          <w:rFonts w:ascii="Calibri" w:hAnsi="Calibri"/>
+          <w:b/>
+          <w:i w:val="0"/>
+          <w:sz w:val="22"/>
+        </w:rPr>
+        <w:t>Table 4:</w:t>
+      </w:r>
+      <w:r>
+        <w:rPr>
+          <w:rFonts w:ascii="Calibri" w:hAnsi="Calibri"/>
+          <w:b w:val="0"/>
+          <w:i w:val="0"/>
+          <w:sz w:val="22"/>
+        </w:rPr>
+        <w:t xml:space="preserve"> Alignment of project progress with final dissertation criteria</w:t>
+      </w:r>
+    </w:p>
+    <w:p>
+      <w:pPr>
+        <w:pStyle w:val="Heading1"/>
+      </w:pPr>
+      <w:r>
+        <w:t>1. Summary Literature Review</w:t>
+      </w:r>
+    </w:p>
+    <w:p>
+      <w:r>
+        <w:rPr>
+          <w:rFonts w:ascii="Calibri" w:hAnsi="Calibri"/>
+          <w:b w:val="0"/>
+          <w:i w:val="0"/>
+          <w:sz w:val="22"/>
+        </w:rPr>
         <w:t>This section critically summarises the current academic literature in my subject area. It provides the academic framework for the research I am undertaking. I evaluate the strengths and limitations of prior work and identify the gap that my project addresses. Figure 1 gives an overview of the main categories of intrusion detection approaches relevant to IoT and this project.</w:t>
+      </w:r>
+    </w:p>
+    <w:p>
+      <w:pPr>
+        <w:jc w:val="center"/>
+      </w:pPr>
+      <w:r>
+        <w:drawing>
+          <wp:inline xmlns:a="http://schemas.openxmlformats.org/drawingml/2006/main" xmlns:pic="http://schemas.openxmlformats.org/drawingml/2006/picture">
+            <wp:extent cx="4572000" cy="2762250"/>
+            <wp:docPr id="1" name="Picture 1"/>
+            <wp:cNvGraphicFramePr>
+              <a:graphicFrameLocks noChangeAspect="1"/>
+            </wp:cNvGraphicFramePr>
+            <a:graphic>
+              <a:graphicData uri="http://schemas.openxmlformats.org/drawingml/2006/picture">
+                <pic:pic>
+                  <pic:nvPicPr>
+                    <pic:cNvPr id="0" name="literature_ids_taxonomy.png"/>
+                    <pic:cNvPicPr/>
+                  </pic:nvPicPr>
+                  <pic:blipFill>
+                    <a:blip r:embed="rId9"/>
+                    <a:stretch>
+                      <a:fillRect/>
+                    </a:stretch>
+                  </pic:blipFill>
+                  <pic:spPr>
+                    <a:xfrm>
+                      <a:off x="0" y="0"/>
+                      <a:ext cx="4572000" cy="2762250"/>
+                    </a:xfrm>
+                    <a:prstGeom prst="rect"/>
+                  </pic:spPr>
+                </pic:pic>
+              </a:graphicData>
+            </a:graphic>
+          </wp:inline>
+        </w:drawing>
+      </w:r>
+    </w:p>
+    <w:p>
+      <w:pPr>
+        <w:jc w:val="center"/>
+        <w:spacing w:before="60" w:after="180" w:line="276" w:lineRule="auto"/>
+      </w:pPr>
+      <w:r>
+        <w:rPr>
+          <w:rFonts w:ascii="Calibri" w:hAnsi="Calibri"/>
+          <w:b w:val="0"/>
+          <w:i/>
+          <w:sz w:val="20"/>
+        </w:rPr>
+        <w:t>Figure 1: Taxonomy of IDS approaches relevant to IoT and this project.</w:t>
       </w:r>
     </w:p>
     <w:p>
@@ -373,6 +815,60 @@
       </w:r>
     </w:p>
     <w:p>
+      <w:pPr>
+        <w:jc w:val="center"/>
+      </w:pPr>
+      <w:r>
+        <w:drawing>
+          <wp:inline xmlns:a="http://schemas.openxmlformats.org/drawingml/2006/main" xmlns:pic="http://schemas.openxmlformats.org/drawingml/2006/picture">
+            <wp:extent cx="4572000" cy="1850887"/>
+            <wp:docPr id="2" name="Picture 2"/>
+            <wp:cNvGraphicFramePr>
+              <a:graphicFrameLocks noChangeAspect="1"/>
+            </wp:cNvGraphicFramePr>
+            <a:graphic>
+              <a:graphicData uri="http://schemas.openxmlformats.org/drawingml/2006/picture">
+                <pic:pic>
+                  <pic:nvPicPr>
+                    <pic:cNvPr id="0" name="literature_dynamic_gnn_concept.png"/>
+                    <pic:cNvPicPr/>
+                  </pic:nvPicPr>
+                  <pic:blipFill>
+                    <a:blip r:embed="rId10"/>
+                    <a:stretch>
+                      <a:fillRect/>
+                    </a:stretch>
+                  </pic:blipFill>
+                  <pic:spPr>
+                    <a:xfrm>
+                      <a:off x="0" y="0"/>
+                      <a:ext cx="4572000" cy="1850887"/>
+                    </a:xfrm>
+                    <a:prstGeom prst="rect"/>
+                  </pic:spPr>
+                </pic:pic>
+              </a:graphicData>
+            </a:graphic>
+          </wp:inline>
+        </w:drawing>
+      </w:r>
+    </w:p>
+    <w:p>
+      <w:pPr>
+        <w:jc w:val="center"/>
+        <w:spacing w:before="60" w:after="180" w:line="276" w:lineRule="auto"/>
+      </w:pPr>
+      <w:r>
+        <w:rPr>
+          <w:rFonts w:ascii="Calibri" w:hAnsi="Calibri"/>
+          <w:b w:val="0"/>
+          <w:i/>
+          <w:sz w:val="20"/>
+        </w:rPr>
+        <w:t>Figure 2: Conceptual flow of a dynamic GNN (GAT + GRU) for temporal graph classification.</w:t>
+      </w:r>
+    </w:p>
+    <w:p>
       <w:r>
         <w:rPr>
           <w:rFonts w:ascii="Calibri" w:hAnsi="Calibri"/>
@@ -419,6 +915,60 @@
       </w:r>
     </w:p>
     <w:p>
+      <w:pPr>
+        <w:jc w:val="center"/>
+      </w:pPr>
+      <w:r>
+        <w:drawing>
+          <wp:inline xmlns:a="http://schemas.openxmlformats.org/drawingml/2006/main" xmlns:pic="http://schemas.openxmlformats.org/drawingml/2006/picture">
+            <wp:extent cx="4572000" cy="2214562"/>
+            <wp:docPr id="3" name="Picture 3"/>
+            <wp:cNvGraphicFramePr>
+              <a:graphicFrameLocks noChangeAspect="1"/>
+            </wp:cNvGraphicFramePr>
+            <a:graphic>
+              <a:graphicData uri="http://schemas.openxmlformats.org/drawingml/2006/picture">
+                <pic:pic>
+                  <pic:nvPicPr>
+                    <pic:cNvPr id="0" name="literature_fedavg_flow.png"/>
+                    <pic:cNvPicPr/>
+                  </pic:nvPicPr>
+                  <pic:blipFill>
+                    <a:blip r:embed="rId11"/>
+                    <a:stretch>
+                      <a:fillRect/>
+                    </a:stretch>
+                  </pic:blipFill>
+                  <pic:spPr>
+                    <a:xfrm>
+                      <a:off x="0" y="0"/>
+                      <a:ext cx="4572000" cy="2214562"/>
+                    </a:xfrm>
+                    <a:prstGeom prst="rect"/>
+                  </pic:spPr>
+                </pic:pic>
+              </a:graphicData>
+            </a:graphic>
+          </wp:inline>
+        </w:drawing>
+      </w:r>
+    </w:p>
+    <w:p>
+      <w:pPr>
+        <w:jc w:val="center"/>
+        <w:spacing w:before="60" w:after="180" w:line="276" w:lineRule="auto"/>
+      </w:pPr>
+      <w:r>
+        <w:rPr>
+          <w:rFonts w:ascii="Calibri" w:hAnsi="Calibri"/>
+          <w:b w:val="0"/>
+          <w:i/>
+          <w:sz w:val="20"/>
+        </w:rPr>
+        <w:t>Figure 3: Federated learning (FedAvg) flow — no raw data leaves clients.</w:t>
+      </w:r>
+    </w:p>
+    <w:p>
       <w:r>
         <w:rPr>
           <w:rFonts w:ascii="Calibri" w:hAnsi="Calibri"/>
@@ -506,6 +1056,60 @@
           <w:sz w:val="22"/>
         </w:rPr>
         <w:t>GAT attention weights provide another form of explanation. They show which neighbour flows influenced each classification. No prior work I found combines both approaches: feature attributions from Integrated Gradients and structural explanations from attention weights. I use both in my project to give analysts richer context for each alert. Figure 4 shows the explainability pipeline used in this project.</w:t>
+      </w:r>
+    </w:p>
+    <w:p>
+      <w:pPr>
+        <w:jc w:val="center"/>
+      </w:pPr>
+      <w:r>
+        <w:drawing>
+          <wp:inline xmlns:a="http://schemas.openxmlformats.org/drawingml/2006/main" xmlns:pic="http://schemas.openxmlformats.org/drawingml/2006/picture">
+            <wp:extent cx="4572000" cy="1937288"/>
+            <wp:docPr id="4" name="Picture 4"/>
+            <wp:cNvGraphicFramePr>
+              <a:graphicFrameLocks noChangeAspect="1"/>
+            </wp:cNvGraphicFramePr>
+            <a:graphic>
+              <a:graphicData uri="http://schemas.openxmlformats.org/drawingml/2006/picture">
+                <pic:pic>
+                  <pic:nvPicPr>
+                    <pic:cNvPr id="0" name="literature_explainability.png"/>
+                    <pic:cNvPicPr/>
+                  </pic:nvPicPr>
+                  <pic:blipFill>
+                    <a:blip r:embed="rId12"/>
+                    <a:stretch>
+                      <a:fillRect/>
+                    </a:stretch>
+                  </pic:blipFill>
+                  <pic:spPr>
+                    <a:xfrm>
+                      <a:off x="0" y="0"/>
+                      <a:ext cx="4572000" cy="1937288"/>
+                    </a:xfrm>
+                    <a:prstGeom prst="rect"/>
+                  </pic:spPr>
+                </pic:pic>
+              </a:graphicData>
+            </a:graphic>
+          </wp:inline>
+        </w:drawing>
+      </w:r>
+    </w:p>
+    <w:p>
+      <w:pPr>
+        <w:jc w:val="center"/>
+        <w:spacing w:before="60" w:after="180" w:line="276" w:lineRule="auto"/>
+      </w:pPr>
+      <w:r>
+        <w:rPr>
+          <w:rFonts w:ascii="Calibri" w:hAnsi="Calibri"/>
+          <w:b w:val="0"/>
+          <w:i/>
+          <w:sz w:val="20"/>
+        </w:rPr>
+        <w:t>Figure 4: Explainability pipeline — Integrated Gradients and GAT attention for SOC alerts.</w:t>
       </w:r>
     </w:p>
     <w:p>
@@ -1711,19 +2315,73 @@
       </w:r>
     </w:p>
     <w:p>
-      <w:r>
-        <w:rPr>
-          <w:rFonts w:ascii="Calibri" w:hAnsi="Calibri"/>
-          <w:b w:val="0"/>
-          <w:i w:val="0"/>
-          <w:sz w:val="22"/>
-        </w:rPr>
-      </w:r>
+      <w:pPr>
+        <w:jc w:val="center"/>
+      </w:pPr>
+      <w:r>
+        <w:drawing>
+          <wp:inline xmlns:a="http://schemas.openxmlformats.org/drawingml/2006/main" xmlns:pic="http://schemas.openxmlformats.org/drawingml/2006/picture">
+            <wp:extent cx="4572000" cy="3053051"/>
+            <wp:docPr id="5" name="Picture 5"/>
+            <wp:cNvGraphicFramePr>
+              <a:graphicFrameLocks noChangeAspect="1"/>
+            </wp:cNvGraphicFramePr>
+            <a:graphic>
+              <a:graphicData uri="http://schemas.openxmlformats.org/drawingml/2006/picture">
+                <pic:pic>
+                  <pic:nvPicPr>
+                    <pic:cNvPr id="0" name="literature_positioning.png"/>
+                    <pic:cNvPicPr/>
+                  </pic:nvPicPr>
+                  <pic:blipFill>
+                    <a:blip r:embed="rId13"/>
+                    <a:stretch>
+                      <a:fillRect/>
+                    </a:stretch>
+                  </pic:blipFill>
+                  <pic:spPr>
+                    <a:xfrm>
+                      <a:off x="0" y="0"/>
+                      <a:ext cx="4572000" cy="3053051"/>
+                    </a:xfrm>
+                    <a:prstGeom prst="rect"/>
+                  </pic:spPr>
+                </pic:pic>
+              </a:graphicData>
+            </a:graphic>
+          </wp:inline>
+        </w:drawing>
+      </w:r>
+    </w:p>
+    <w:p>
+      <w:pPr>
+        <w:jc w:val="center"/>
+        <w:spacing w:before="60" w:after="180" w:line="276" w:lineRule="auto"/>
+      </w:pPr>
       <w:r>
         <w:rPr>
           <w:rFonts w:ascii="Calibri" w:hAnsi="Calibri"/>
           <w:b w:val="0"/>
           <w:i/>
+          <w:sz w:val="20"/>
+        </w:rPr>
+        <w:t>Figure 5: Positioning of related work — GNN, federated learning, explainability, and SIEM.</w:t>
+      </w:r>
+    </w:p>
+    <w:p>
+      <w:r>
+        <w:rPr>
+          <w:rFonts w:ascii="Calibri" w:hAnsi="Calibri"/>
+          <w:b w:val="0"/>
+          <w:i w:val="0"/>
+          <w:sz w:val="22"/>
+        </w:rPr>
+      </w:r>
+      <w:r>
+        <w:rPr>
+          <w:rFonts w:ascii="Calibri" w:hAnsi="Calibri"/>
+          <w:b w:val="0"/>
+          <w:i/>
           <w:sz w:val="22"/>
         </w:rPr>
         <w:t>Sources: All references cited in Table 1. This figure synthesises the literature review.</w:t>
@@ -1735,6 +2393,136 @@
           <w:i w:val="0"/>
           <w:sz w:val="22"/>
         </w:rPr>
+      </w:r>
+    </w:p>
+    <w:p>
+      <w:r>
+        <w:rPr>
+          <w:rFonts w:ascii="Calibri" w:hAnsi="Calibri"/>
+          <w:b w:val="0"/>
+          <w:i w:val="0"/>
+          <w:sz w:val="22"/>
+        </w:rPr>
+        <w:t>To make the project positioning clearer, Figure 6 maps the four literature pillars directly to the integrated design used in this project.</w:t>
+      </w:r>
+    </w:p>
+    <w:p>
+      <w:pPr>
+        <w:jc w:val="center"/>
+      </w:pPr>
+      <w:r>
+        <w:drawing>
+          <wp:inline xmlns:a="http://schemas.openxmlformats.org/drawingml/2006/main" xmlns:pic="http://schemas.openxmlformats.org/drawingml/2006/picture">
+            <wp:extent cx="4572000" cy="3048000"/>
+            <wp:docPr id="6" name="Picture 6"/>
+            <wp:cNvGraphicFramePr>
+              <a:graphicFrameLocks noChangeAspect="1"/>
+            </wp:cNvGraphicFramePr>
+            <a:graphic>
+              <a:graphicData uri="http://schemas.openxmlformats.org/drawingml/2006/picture">
+                <pic:pic>
+                  <pic:nvPicPr>
+                    <pic:cNvPr id="0" name="literature_project_pillars.png"/>
+                    <pic:cNvPicPr/>
+                  </pic:nvPicPr>
+                  <pic:blipFill>
+                    <a:blip r:embed="rId14"/>
+                    <a:stretch>
+                      <a:fillRect/>
+                    </a:stretch>
+                  </pic:blipFill>
+                  <pic:spPr>
+                    <a:xfrm>
+                      <a:off x="0" y="0"/>
+                      <a:ext cx="4572000" cy="3048000"/>
+                    </a:xfrm>
+                    <a:prstGeom prst="rect"/>
+                  </pic:spPr>
+                </pic:pic>
+              </a:graphicData>
+            </a:graphic>
+          </wp:inline>
+        </w:drawing>
+      </w:r>
+    </w:p>
+    <w:p>
+      <w:pPr>
+        <w:jc w:val="center"/>
+        <w:spacing w:before="60" w:after="180" w:line="276" w:lineRule="auto"/>
+      </w:pPr>
+      <w:r>
+        <w:rPr>
+          <w:rFonts w:ascii="Calibri" w:hAnsi="Calibri"/>
+          <w:b w:val="0"/>
+          <w:i/>
+          <w:sz w:val="20"/>
+        </w:rPr>
+        <w:t>Figure 6: Project integration of four literature pillars.</w:t>
+      </w:r>
+    </w:p>
+    <w:p>
+      <w:r>
+        <w:rPr>
+          <w:rFonts w:ascii="Calibri" w:hAnsi="Calibri"/>
+          <w:b w:val="0"/>
+          <w:i w:val="0"/>
+          <w:sz w:val="22"/>
+        </w:rPr>
+        <w:t>Finally, Figure 7 presents the end-to-end project pipeline, included here to show how the literature insights are translated into an operational research design.</w:t>
+      </w:r>
+    </w:p>
+    <w:p>
+      <w:pPr>
+        <w:jc w:val="center"/>
+      </w:pPr>
+      <w:r>
+        <w:drawing>
+          <wp:inline xmlns:a="http://schemas.openxmlformats.org/drawingml/2006/main" xmlns:pic="http://schemas.openxmlformats.org/drawingml/2006/picture">
+            <wp:extent cx="4572000" cy="5720744"/>
+            <wp:docPr id="7" name="Picture 7"/>
+            <wp:cNvGraphicFramePr>
+              <a:graphicFrameLocks noChangeAspect="1"/>
+            </wp:cNvGraphicFramePr>
+            <a:graphic>
+              <a:graphicData uri="http://schemas.openxmlformats.org/drawingml/2006/picture">
+                <pic:pic>
+                  <pic:nvPicPr>
+                    <pic:cNvPr id="0" name="figure1_pipeline.png"/>
+                    <pic:cNvPicPr/>
+                  </pic:nvPicPr>
+                  <pic:blipFill>
+                    <a:blip r:embed="rId15"/>
+                    <a:stretch>
+                      <a:fillRect/>
+                    </a:stretch>
+                  </pic:blipFill>
+                  <pic:spPr>
+                    <a:xfrm>
+                      <a:off x="0" y="0"/>
+                      <a:ext cx="4572000" cy="5720744"/>
+                    </a:xfrm>
+                    <a:prstGeom prst="rect"/>
+                  </pic:spPr>
+                </pic:pic>
+              </a:graphicData>
+            </a:graphic>
+          </wp:inline>
+        </w:drawing>
+      </w:r>
+    </w:p>
+    <w:p>
+      <w:pPr>
+        <w:jc w:val="center"/>
+        <w:spacing w:before="60" w:after="180" w:line="276" w:lineRule="auto"/>
+      </w:pPr>
+      <w:r>
+        <w:rPr>
+          <w:rFonts w:ascii="Calibri" w:hAnsi="Calibri"/>
+          <w:b w:val="0"/>
+          <w:i/>
+          <w:sz w:val="20"/>
+        </w:rPr>
+        <w:t>Figure 7: End-to-end research pipeline aligned with literature findings.</w:t>
       </w:r>
     </w:p>
     <w:p>
@@ -3138,7 +3926,7 @@
           <w:i w:val="0"/>
           <w:sz w:val="22"/>
         </w:rPr>
-        <w:t>F1-score</w:t>
+        <w:t>Recall</w:t>
       </w:r>
       <w:r>
         <w:rPr>
@@ -3147,7 +3935,7 @@
           <w:i w:val="0"/>
           <w:sz w:val="22"/>
         </w:rPr>
-        <w:t xml:space="preserve"> (Eq. 3): the harmonic mean of precision and recall.</w:t>
+        <w:t xml:space="preserve"> (Eq. 2): the fraction of actual attacks that the model correctly finds.</w:t>
       </w:r>
     </w:p>
     <w:p>
@@ -3175,7 +3963,7 @@
           <w:i/>
           <w:sz w:val="22"/>
         </w:rPr>
-        <w:t>F₁ = 2 × Precision × Recall / (Precision + Recall)</w:t>
+        <w:t>Recall = TP / (TP + FN)</w:t>
       </w:r>
       <w:r>
         <w:rPr>
@@ -3193,7 +3981,7 @@
           <w:i w:val="0"/>
           <w:sz w:val="22"/>
         </w:rPr>
-        <w:t>(3)</w:t>
+        <w:t>(2)</w:t>
       </w:r>
     </w:p>
     <w:p>
@@ -3212,7 +4000,7 @@
           <w:i w:val="0"/>
           <w:sz w:val="22"/>
         </w:rPr>
-        <w:t>ROC-AUC</w:t>
+        <w:t>F1-score</w:t>
       </w:r>
       <w:r>
         <w:rPr>
@@ -3221,7 +4009,7 @@
           <w:i w:val="0"/>
           <w:sz w:val="22"/>
         </w:rPr>
-        <w:t xml:space="preserve"> (Eq. 5): area under the Receiver Operating Characteristic curve. The ROC curve plots true positive rate against false positive rate at varying thresholds. AUC of 1.0 indicates perfect ranking; 0.5 indicates random guessing.</w:t>
+        <w:t xml:space="preserve"> (Eq. 3): the harmonic mean of precision and recall.</w:t>
       </w:r>
     </w:p>
     <w:p>
@@ -3249,6 +4037,154 @@
           <w:i/>
           <w:sz w:val="22"/>
         </w:rPr>
+        <w:t>F₁ = 2 × Precision × Recall / (Precision + Recall)</w:t>
+      </w:r>
+      <w:r>
+        <w:rPr>
+          <w:rFonts w:ascii="Calibri" w:hAnsi="Calibri"/>
+          <w:b w:val="0"/>
+          <w:i w:val="0"/>
+          <w:sz w:val="22"/>
+        </w:rPr>
+        <w:tab/>
+      </w:r>
+      <w:r>
+        <w:rPr>
+          <w:rFonts w:ascii="Calibri" w:hAnsi="Calibri"/>
+          <w:b w:val="0"/>
+          <w:i w:val="0"/>
+          <w:sz w:val="22"/>
+        </w:rPr>
+        <w:t>(3)</w:t>
+      </w:r>
+    </w:p>
+    <w:p>
+      <w:r>
+        <w:rPr>
+          <w:rFonts w:ascii="Calibri" w:hAnsi="Calibri"/>
+          <w:b w:val="0"/>
+          <w:i w:val="0"/>
+          <w:sz w:val="22"/>
+        </w:rPr>
+      </w:r>
+      <w:r>
+        <w:rPr>
+          <w:rFonts w:ascii="Calibri" w:hAnsi="Calibri"/>
+          <w:b/>
+          <w:i w:val="0"/>
+          <w:sz w:val="22"/>
+        </w:rPr>
+        <w:t>False Alarm Rate</w:t>
+      </w:r>
+      <w:r>
+        <w:rPr>
+          <w:rFonts w:ascii="Calibri" w:hAnsi="Calibri"/>
+          <w:b w:val="0"/>
+          <w:i w:val="0"/>
+          <w:sz w:val="22"/>
+        </w:rPr>
+        <w:t xml:space="preserve"> (Eq. 4): the fraction of benign traffic incorrectly flagged as an attack.</w:t>
+      </w:r>
+    </w:p>
+    <w:p>
+      <w:pPr>
+        <w:jc w:val="center"/>
+        <w:spacing w:before="120" w:after="120" w:line="276" w:lineRule="auto"/>
+        <w:tabs>
+          <w:tab w:val="center" w:pos="4680"/>
+          <w:tab w:val="right" w:pos="9360"/>
+        </w:tabs>
+      </w:pPr>
+      <w:r>
+        <w:rPr>
+          <w:rFonts w:ascii="Calibri" w:hAnsi="Calibri"/>
+          <w:b w:val="0"/>
+          <w:i w:val="0"/>
+          <w:sz w:val="22"/>
+        </w:rPr>
+        <w:tab/>
+      </w:r>
+      <w:r>
+        <w:rPr>
+          <w:rFonts w:ascii="Calibri" w:hAnsi="Calibri"/>
+          <w:b w:val="0"/>
+          <w:i/>
+          <w:sz w:val="22"/>
+        </w:rPr>
+        <w:t>FAR = FP / (FP + TN)</w:t>
+      </w:r>
+      <w:r>
+        <w:rPr>
+          <w:rFonts w:ascii="Calibri" w:hAnsi="Calibri"/>
+          <w:b w:val="0"/>
+          <w:i w:val="0"/>
+          <w:sz w:val="22"/>
+        </w:rPr>
+        <w:tab/>
+      </w:r>
+      <w:r>
+        <w:rPr>
+          <w:rFonts w:ascii="Calibri" w:hAnsi="Calibri"/>
+          <w:b w:val="0"/>
+          <w:i w:val="0"/>
+          <w:sz w:val="22"/>
+        </w:rPr>
+        <w:t>(4)</w:t>
+      </w:r>
+    </w:p>
+    <w:p>
+      <w:r>
+        <w:rPr>
+          <w:rFonts w:ascii="Calibri" w:hAnsi="Calibri"/>
+          <w:b w:val="0"/>
+          <w:i w:val="0"/>
+          <w:sz w:val="22"/>
+        </w:rPr>
+      </w:r>
+      <w:r>
+        <w:rPr>
+          <w:rFonts w:ascii="Calibri" w:hAnsi="Calibri"/>
+          <w:b/>
+          <w:i w:val="0"/>
+          <w:sz w:val="22"/>
+        </w:rPr>
+        <w:t>ROC-AUC</w:t>
+      </w:r>
+      <w:r>
+        <w:rPr>
+          <w:rFonts w:ascii="Calibri" w:hAnsi="Calibri"/>
+          <w:b w:val="0"/>
+          <w:i w:val="0"/>
+          <w:sz w:val="22"/>
+        </w:rPr>
+        <w:t xml:space="preserve"> (Eq. 5): area under the Receiver Operating Characteristic curve. The ROC curve plots true positive rate against false positive rate at varying thresholds. AUC of 1.0 indicates perfect ranking; 0.5 indicates random guessing.</w:t>
+      </w:r>
+    </w:p>
+    <w:p>
+      <w:pPr>
+        <w:jc w:val="center"/>
+        <w:spacing w:before="120" w:after="120" w:line="276" w:lineRule="auto"/>
+        <w:tabs>
+          <w:tab w:val="center" w:pos="4680"/>
+          <w:tab w:val="right" w:pos="9360"/>
+        </w:tabs>
+      </w:pPr>
+      <w:r>
+        <w:rPr>
+          <w:rFonts w:ascii="Calibri" w:hAnsi="Calibri"/>
+          <w:b w:val="0"/>
+          <w:i w:val="0"/>
+          <w:sz w:val="22"/>
+        </w:rPr>
+        <w:tab/>
+      </w:r>
+      <w:r>
+        <w:rPr>
+          <w:rFonts w:ascii="Calibri" w:hAnsi="Calibri"/>
+          <w:b w:val="0"/>
+          <w:i/>
+          <w:sz w:val="22"/>
+        </w:rPr>
         <w:t>AUC = ∫₀¹ TPR(t) d(FPR(t))</w:t>
       </w:r>
       <w:r>
@@ -3268,6 +4204,130 @@
           <w:sz w:val="22"/>
         </w:rPr>
         <w:t>(5)</w:t>
+      </w:r>
+    </w:p>
+    <w:p>
+      <w:r>
+        <w:rPr>
+          <w:rFonts w:ascii="Calibri" w:hAnsi="Calibri"/>
+          <w:b w:val="0"/>
+          <w:i w:val="0"/>
+          <w:sz w:val="22"/>
+        </w:rPr>
+      </w:r>
+      <w:r>
+        <w:rPr>
+          <w:rFonts w:ascii="Calibri" w:hAnsi="Calibri"/>
+          <w:b/>
+          <w:i w:val="0"/>
+          <w:sz w:val="22"/>
+        </w:rPr>
+        <w:t>Additionally:</w:t>
+      </w:r>
+      <w:r>
+        <w:rPr>
+          <w:rFonts w:ascii="Calibri" w:hAnsi="Calibri"/>
+          <w:b w:val="0"/>
+          <w:i w:val="0"/>
+          <w:sz w:val="22"/>
+        </w:rPr>
+        <w:t xml:space="preserve"> confusion matrix (TP, TN, FP, FN counts), CPU inference time (milliseconds per sample), and communication cost (total bytes sent during federated training). False alarm rate is very important for SOCs. High recall with a high false alarm rate means too many false positives and analysts get overwhelmed.</w:t>
+      </w:r>
+    </w:p>
+    <w:p>
+      <w:pPr>
+        <w:pStyle w:val="Heading2"/>
+      </w:pPr>
+      <w:r>
+        <w:t>2.7 Explainability and SIEM Integration</w:t>
+      </w:r>
+    </w:p>
+    <w:p>
+      <w:r>
+        <w:rPr>
+          <w:rFonts w:ascii="Calibri" w:hAnsi="Calibri"/>
+          <w:b w:val="0"/>
+          <w:i w:val="0"/>
+          <w:sz w:val="22"/>
+        </w:rPr>
+        <w:t>I use two methods for explainability:</w:t>
+      </w:r>
+    </w:p>
+    <w:p>
+      <w:pPr>
+        <w:pStyle w:val="ListNumber"/>
+      </w:pPr>
+      <w:r>
+        <w:rPr>
+          <w:rFonts w:ascii="Calibri" w:hAnsi="Calibri"/>
+          <w:b w:val="0"/>
+          <w:i w:val="0"/>
+          <w:sz w:val="22"/>
+        </w:rPr>
+      </w:r>
+      <w:r>
+        <w:rPr>
+          <w:rFonts w:ascii="Calibri" w:hAnsi="Calibri"/>
+          <w:b/>
+          <w:i w:val="0"/>
+          <w:sz w:val="22"/>
+        </w:rPr>
+        <w:t>Integrated Gradients (Captum):</w:t>
+      </w:r>
+      <w:r>
+        <w:rPr>
+          <w:rFonts w:ascii="Calibri" w:hAnsi="Calibri"/>
+          <w:b w:val="0"/>
+          <w:i w:val="0"/>
+          <w:sz w:val="22"/>
+        </w:rPr>
+        <w:t xml:space="preserve"> For each flagged flow, feature attributions are computed by accumulating gradients along a path from a zero-valued baseline to the actual input (Eq. 6). The top-5 contributing features are extracted and included in the alert.</w:t>
+      </w:r>
+    </w:p>
+    <w:p>
+      <w:pPr>
+        <w:jc w:val="center"/>
+        <w:spacing w:before="120" w:after="120" w:line="276" w:lineRule="auto"/>
+        <w:tabs>
+          <w:tab w:val="center" w:pos="4680"/>
+          <w:tab w:val="right" w:pos="9360"/>
+        </w:tabs>
+      </w:pPr>
+      <w:r>
+        <w:rPr>
+          <w:rFonts w:ascii="Calibri" w:hAnsi="Calibri"/>
+          <w:b w:val="0"/>
+          <w:i w:val="0"/>
+          <w:sz w:val="22"/>
+        </w:rPr>
+        <w:tab/>
+      </w:r>
+      <w:r>
+        <w:rPr>
+          <w:rFonts w:ascii="Calibri" w:hAnsi="Calibri"/>
+          <w:b w:val="0"/>
+          <w:i/>
+          <w:sz w:val="22"/>
+        </w:rPr>
+        <w:t>IGᵢ(x) = (xᵢ − x′ᵢ) × ∫₀¹ ∂F(x′ + α(x − x′)) / ∂xᵢ dα</w:t>
+      </w:r>
+      <w:r>
+        <w:rPr>
+          <w:rFonts w:ascii="Calibri" w:hAnsi="Calibri"/>
+          <w:b w:val="0"/>
+          <w:i w:val="0"/>
+          <w:sz w:val="22"/>
+        </w:rPr>
+        <w:tab/>
+      </w:r>
+      <w:r>
+        <w:rPr>
+          <w:rFonts w:ascii="Calibri" w:hAnsi="Calibri"/>
+          <w:b w:val="0"/>
+          <w:i w:val="0"/>
+          <w:sz w:val="22"/>
+        </w:rPr>
+        <w:t>(6)</w:t>
       </w:r>
     </w:p>
     <w:p>
@@ -3334,7 +4394,7 @@
           <w:i w:val="0"/>
           <w:sz w:val="22"/>
         </w:rPr>
-        <w:t>Figure 6 shows the full research pipeline from raw data to SIEM alerts.</w:t>
+        <w:t>The full research pipeline from raw data to SIEM alerts is shown earlier in Figure 7 and is used here as the implementation reference for this section.</w:t>
       </w:r>
     </w:p>
     <w:p>
@@ -4828,6 +5888,1017 @@
       </w:tr>
     </w:tbl>
     <w:p>
+      <w:r>
+        <w:rPr>
+          <w:rFonts w:ascii="Calibri" w:hAnsi="Calibri"/>
+          <w:b w:val="0"/>
+          <w:i w:val="0"/>
+          <w:sz w:val="22"/>
+        </w:rPr>
+        <w:t>Figure 8 provides a visual roadmap of the remaining project phases from interim submission to final submission.</w:t>
+      </w:r>
+    </w:p>
+    <w:p>
+      <w:pPr>
+        <w:jc w:val="center"/>
+      </w:pPr>
+      <w:r>
+        <w:drawing>
+          <wp:inline xmlns:a="http://schemas.openxmlformats.org/drawingml/2006/main" xmlns:pic="http://schemas.openxmlformats.org/drawingml/2006/picture">
+            <wp:extent cx="4572000" cy="2194560"/>
+            <wp:docPr id="8" name="Picture 8"/>
+            <wp:cNvGraphicFramePr>
+              <a:graphicFrameLocks noChangeAspect="1"/>
+            </wp:cNvGraphicFramePr>
+            <a:graphic>
+              <a:graphicData uri="http://schemas.openxmlformats.org/drawingml/2006/picture">
+                <pic:pic>
+                  <pic:nvPicPr>
+                    <pic:cNvPr id="0" name="interim_completion_roadmap.png"/>
+                    <pic:cNvPicPr/>
+                  </pic:nvPicPr>
+                  <pic:blipFill>
+                    <a:blip r:embed="rId16"/>
+                    <a:stretch>
+                      <a:fillRect/>
+                    </a:stretch>
+                  </pic:blipFill>
+                  <pic:spPr>
+                    <a:xfrm>
+                      <a:off x="0" y="0"/>
+                      <a:ext cx="4572000" cy="2194560"/>
+                    </a:xfrm>
+                    <a:prstGeom prst="rect"/>
+                  </pic:spPr>
+                </pic:pic>
+              </a:graphicData>
+            </a:graphic>
+          </wp:inline>
+        </w:drawing>
+      </w:r>
+    </w:p>
+    <w:p>
+      <w:pPr>
+        <w:jc w:val="center"/>
+        <w:spacing w:before="60" w:after="180" w:line="276" w:lineRule="auto"/>
+      </w:pPr>
+      <w:r>
+        <w:rPr>
+          <w:rFonts w:ascii="Calibri" w:hAnsi="Calibri"/>
+          <w:b w:val="0"/>
+          <w:i/>
+          <w:sz w:val="20"/>
+        </w:rPr>
+        <w:t>Figure 8: Interim-to-final completion roadmap.</w:t>
+      </w:r>
+    </w:p>
+    <w:p>
+      <w:pPr>
+        <w:pStyle w:val="Heading2"/>
+      </w:pPr>
+      <w:r>
+        <w:t>3.2.1 Alignment with Final Dissertation Criteria</w:t>
+      </w:r>
+    </w:p>
+    <w:p>
+      <w:r>
+        <w:rPr>
+          <w:rFonts w:ascii="Calibri" w:hAnsi="Calibri"/>
+          <w:b w:val="0"/>
+          <w:i w:val="0"/>
+          <w:sz w:val="22"/>
+        </w:rPr>
+        <w:t>The final dissertation is assessed using weighted criteria. Table 4 shows how my current progress and remaining work align with these criteria. This helps ensure that the final submission is balanced and complete.</w:t>
+      </w:r>
+    </w:p>
+    <w:p>
+      <w:r>
+        <w:rPr>
+          <w:rFonts w:ascii="Calibri" w:hAnsi="Calibri"/>
+          <w:b w:val="0"/>
+          <w:i w:val="0"/>
+          <w:sz w:val="22"/>
+        </w:rPr>
+      </w:r>
+      <w:r>
+        <w:rPr>
+          <w:rFonts w:ascii="Calibri" w:hAnsi="Calibri"/>
+          <w:b/>
+          <w:i w:val="0"/>
+          <w:sz w:val="22"/>
+        </w:rPr>
+        <w:t>Table 4: Alignment of Project Progress with Final Dissertation Criteria</w:t>
+      </w:r>
+      <w:r>
+        <w:rPr>
+          <w:rFonts w:ascii="Calibri" w:hAnsi="Calibri"/>
+          <w:b w:val="0"/>
+          <w:i w:val="0"/>
+          <w:sz w:val="22"/>
+        </w:rPr>
+      </w:r>
+    </w:p>
+    <w:tbl>
+      <w:tblPr>
+        <w:tblStyle w:val="TableGrid"/>
+        <w:tblW w:type="auto" w:w="0"/>
+        <w:jc w:val="center"/>
+        <w:tblLook w:firstColumn="1" w:firstRow="1" w:lastColumn="0" w:lastRow="0" w:noHBand="0" w:noVBand="1" w:val="04A0"/>
+      </w:tblPr>
+      <w:tblGrid>
+        <w:gridCol w:w="2160"/>
+        <w:gridCol w:w="2160"/>
+        <w:gridCol w:w="2160"/>
+        <w:gridCol w:w="2160"/>
+      </w:tblGrid>
+      <w:tr>
+        <w:tc>
+          <w:tcPr>
+            <w:tcW w:type="dxa" w:w="2160"/>
+            <w:shd w:fill="4472C4"/>
+            <w:tcBorders>
+              <w:top w:sz="4" w:val="single" w:color="4472C4"/>
+              <w:start w:sz="4" w:val="single" w:color="4472C4"/>
+              <w:bottom w:sz="4" w:val="single" w:color="4472C4"/>
+              <w:end w:sz="4" w:val="single" w:color="4472C4"/>
+            </w:tcBorders>
+          </w:tcPr>
+          <w:p>
+            <w:r/>
+            <w:r>
+              <w:rPr>
+                <w:rFonts w:ascii="Calibri" w:hAnsi="Calibri"/>
+                <w:b/>
+                <w:i w:val="0"/>
+                <w:color w:val="FFFFFF"/>
+                <w:sz w:val="20"/>
+              </w:rPr>
+              <w:t>Final Criterion</w:t>
+            </w:r>
+          </w:p>
+        </w:tc>
+        <w:tc>
+          <w:tcPr>
+            <w:tcW w:type="dxa" w:w="2160"/>
+            <w:shd w:fill="4472C4"/>
+            <w:tcBorders>
+              <w:top w:sz="4" w:val="single" w:color="4472C4"/>
+              <w:start w:sz="4" w:val="single" w:color="4472C4"/>
+              <w:bottom w:sz="4" w:val="single" w:color="4472C4"/>
+              <w:end w:sz="4" w:val="single" w:color="4472C4"/>
+            </w:tcBorders>
+          </w:tcPr>
+          <w:p>
+            <w:r/>
+            <w:r>
+              <w:rPr>
+                <w:rFonts w:ascii="Calibri" w:hAnsi="Calibri"/>
+                <w:b/>
+                <w:i w:val="0"/>
+                <w:color w:val="FFFFFF"/>
+                <w:sz w:val="20"/>
+              </w:rPr>
+              <w:t>Weight</w:t>
+            </w:r>
+          </w:p>
+        </w:tc>
+        <w:tc>
+          <w:tcPr>
+            <w:tcW w:type="dxa" w:w="2160"/>
+            <w:shd w:fill="4472C4"/>
+            <w:tcBorders>
+              <w:top w:sz="4" w:val="single" w:color="4472C4"/>
+              <w:start w:sz="4" w:val="single" w:color="4472C4"/>
+              <w:bottom w:sz="4" w:val="single" w:color="4472C4"/>
+              <w:end w:sz="4" w:val="single" w:color="4472C4"/>
+            </w:tcBorders>
+          </w:tcPr>
+          <w:p>
+            <w:r/>
+            <w:r>
+              <w:rPr>
+                <w:rFonts w:ascii="Calibri" w:hAnsi="Calibri"/>
+                <w:b/>
+                <w:i w:val="0"/>
+                <w:color w:val="FFFFFF"/>
+                <w:sz w:val="20"/>
+              </w:rPr>
+              <w:t>Interim Status</w:t>
+            </w:r>
+          </w:p>
+        </w:tc>
+        <w:tc>
+          <w:tcPr>
+            <w:tcW w:type="dxa" w:w="2160"/>
+            <w:shd w:fill="4472C4"/>
+            <w:tcBorders>
+              <w:top w:sz="4" w:val="single" w:color="4472C4"/>
+              <w:start w:sz="4" w:val="single" w:color="4472C4"/>
+              <w:bottom w:sz="4" w:val="single" w:color="4472C4"/>
+              <w:end w:sz="4" w:val="single" w:color="4472C4"/>
+            </w:tcBorders>
+          </w:tcPr>
+          <w:p>
+            <w:r/>
+            <w:r>
+              <w:rPr>
+                <w:rFonts w:ascii="Calibri" w:hAnsi="Calibri"/>
+                <w:b/>
+                <w:i w:val="0"/>
+                <w:color w:val="FFFFFF"/>
+                <w:sz w:val="20"/>
+              </w:rPr>
+              <w:t>Planned Improvement Before Final Submission</w:t>
+            </w:r>
+          </w:p>
+        </w:tc>
+      </w:tr>
+      <w:tr>
+        <w:tc>
+          <w:tcPr>
+            <w:tcW w:type="dxa" w:w="2160"/>
+            <w:shd w:fill="F2F2F2"/>
+            <w:tcBorders>
+              <w:top w:sz="4" w:val="single" w:color="BFBFBF"/>
+              <w:start w:sz="4" w:val="single" w:color="BFBFBF"/>
+              <w:bottom w:sz="4" w:val="single" w:color="BFBFBF"/>
+              <w:end w:sz="4" w:val="single" w:color="BFBFBF"/>
+            </w:tcBorders>
+          </w:tcPr>
+          <w:p>
+            <w:r/>
+            <w:r>
+              <w:rPr>
+                <w:rFonts w:ascii="Calibri" w:hAnsi="Calibri"/>
+                <w:b w:val="0"/>
+                <w:i w:val="0"/>
+                <w:sz w:val="20"/>
+              </w:rPr>
+              <w:t>Introduction</w:t>
+            </w:r>
+          </w:p>
+        </w:tc>
+        <w:tc>
+          <w:tcPr>
+            <w:tcW w:type="dxa" w:w="2160"/>
+            <w:shd w:fill="F2F2F2"/>
+            <w:tcBorders>
+              <w:top w:sz="4" w:val="single" w:color="BFBFBF"/>
+              <w:start w:sz="4" w:val="single" w:color="BFBFBF"/>
+              <w:bottom w:sz="4" w:val="single" w:color="BFBFBF"/>
+              <w:end w:sz="4" w:val="single" w:color="BFBFBF"/>
+            </w:tcBorders>
+          </w:tcPr>
+          <w:p>
+            <w:r/>
+            <w:r>
+              <w:rPr>
+                <w:rFonts w:ascii="Calibri" w:hAnsi="Calibri"/>
+                <w:b w:val="0"/>
+                <w:i w:val="0"/>
+                <w:sz w:val="20"/>
+              </w:rPr>
+              <w:t>5%</w:t>
+            </w:r>
+          </w:p>
+        </w:tc>
+        <w:tc>
+          <w:tcPr>
+            <w:tcW w:type="dxa" w:w="2160"/>
+            <w:shd w:fill="F2F2F2"/>
+            <w:tcBorders>
+              <w:top w:sz="4" w:val="single" w:color="BFBFBF"/>
+              <w:start w:sz="4" w:val="single" w:color="BFBFBF"/>
+              <w:bottom w:sz="4" w:val="single" w:color="BFBFBF"/>
+              <w:end w:sz="4" w:val="single" w:color="BFBFBF"/>
+            </w:tcBorders>
+          </w:tcPr>
+          <w:p>
+            <w:r/>
+            <w:r>
+              <w:rPr>
+                <w:rFonts w:ascii="Calibri" w:hAnsi="Calibri"/>
+                <w:b w:val="0"/>
+                <w:i w:val="0"/>
+                <w:sz w:val="20"/>
+              </w:rPr>
+              <w:t>Drafted clearly in final dissertation structure</w:t>
+            </w:r>
+          </w:p>
+        </w:tc>
+        <w:tc>
+          <w:tcPr>
+            <w:tcW w:type="dxa" w:w="2160"/>
+            <w:shd w:fill="F2F2F2"/>
+            <w:tcBorders>
+              <w:top w:sz="4" w:val="single" w:color="BFBFBF"/>
+              <w:start w:sz="4" w:val="single" w:color="BFBFBF"/>
+              <w:bottom w:sz="4" w:val="single" w:color="BFBFBF"/>
+              <w:end w:sz="4" w:val="single" w:color="BFBFBF"/>
+            </w:tcBorders>
+          </w:tcPr>
+          <w:p>
+            <w:r/>
+            <w:r>
+              <w:rPr>
+                <w:rFonts w:ascii="Calibri" w:hAnsi="Calibri"/>
+                <w:b w:val="0"/>
+                <w:i w:val="0"/>
+                <w:sz w:val="20"/>
+              </w:rPr>
+              <w:t>Tighten motivation and scope after final results</w:t>
+            </w:r>
+          </w:p>
+        </w:tc>
+      </w:tr>
+      <w:tr>
+        <w:tc>
+          <w:tcPr>
+            <w:tcW w:type="dxa" w:w="2160"/>
+            <w:shd w:fill="FFFFFF"/>
+            <w:tcBorders>
+              <w:top w:sz="4" w:val="single" w:color="BFBFBF"/>
+              <w:start w:sz="4" w:val="single" w:color="BFBFBF"/>
+              <w:bottom w:sz="4" w:val="single" w:color="BFBFBF"/>
+              <w:end w:sz="4" w:val="single" w:color="BFBFBF"/>
+            </w:tcBorders>
+          </w:tcPr>
+          <w:p>
+            <w:r/>
+            <w:r>
+              <w:rPr>
+                <w:rFonts w:ascii="Calibri" w:hAnsi="Calibri"/>
+                <w:b w:val="0"/>
+                <w:i w:val="0"/>
+                <w:sz w:val="20"/>
+              </w:rPr>
+              <w:t>Context / Literature Review</w:t>
+            </w:r>
+          </w:p>
+        </w:tc>
+        <w:tc>
+          <w:tcPr>
+            <w:tcW w:type="dxa" w:w="2160"/>
+            <w:shd w:fill="FFFFFF"/>
+            <w:tcBorders>
+              <w:top w:sz="4" w:val="single" w:color="BFBFBF"/>
+              <w:start w:sz="4" w:val="single" w:color="BFBFBF"/>
+              <w:bottom w:sz="4" w:val="single" w:color="BFBFBF"/>
+              <w:end w:sz="4" w:val="single" w:color="BFBFBF"/>
+            </w:tcBorders>
+          </w:tcPr>
+          <w:p>
+            <w:r/>
+            <w:r>
+              <w:rPr>
+                <w:rFonts w:ascii="Calibri" w:hAnsi="Calibri"/>
+                <w:b w:val="0"/>
+                <w:i w:val="0"/>
+                <w:sz w:val="20"/>
+              </w:rPr>
+              <w:t>20%</w:t>
+            </w:r>
+          </w:p>
+        </w:tc>
+        <w:tc>
+          <w:tcPr>
+            <w:tcW w:type="dxa" w:w="2160"/>
+            <w:shd w:fill="FFFFFF"/>
+            <w:tcBorders>
+              <w:top w:sz="4" w:val="single" w:color="BFBFBF"/>
+              <w:start w:sz="4" w:val="single" w:color="BFBFBF"/>
+              <w:bottom w:sz="4" w:val="single" w:color="BFBFBF"/>
+              <w:end w:sz="4" w:val="single" w:color="BFBFBF"/>
+            </w:tcBorders>
+          </w:tcPr>
+          <w:p>
+            <w:r/>
+            <w:r>
+              <w:rPr>
+                <w:rFonts w:ascii="Calibri" w:hAnsi="Calibri"/>
+                <w:b w:val="0"/>
+                <w:i w:val="0"/>
+                <w:sz w:val="20"/>
+              </w:rPr>
+              <w:t>Strong and expanded with critical analysis, figures, and gap table</w:t>
+            </w:r>
+          </w:p>
+        </w:tc>
+        <w:tc>
+          <w:tcPr>
+            <w:tcW w:type="dxa" w:w="2160"/>
+            <w:shd w:fill="FFFFFF"/>
+            <w:tcBorders>
+              <w:top w:sz="4" w:val="single" w:color="BFBFBF"/>
+              <w:start w:sz="4" w:val="single" w:color="BFBFBF"/>
+              <w:bottom w:sz="4" w:val="single" w:color="BFBFBF"/>
+              <w:end w:sz="4" w:val="single" w:color="BFBFBF"/>
+            </w:tcBorders>
+          </w:tcPr>
+          <w:p>
+            <w:r/>
+            <w:r>
+              <w:rPr>
+                <w:rFonts w:ascii="Calibri" w:hAnsi="Calibri"/>
+                <w:b w:val="0"/>
+                <w:i w:val="0"/>
+                <w:sz w:val="20"/>
+              </w:rPr>
+              <w:t>Add any new references prompted by final findings</w:t>
+            </w:r>
+          </w:p>
+        </w:tc>
+      </w:tr>
+      <w:tr>
+        <w:tc>
+          <w:tcPr>
+            <w:tcW w:type="dxa" w:w="2160"/>
+            <w:shd w:fill="F2F2F2"/>
+            <w:tcBorders>
+              <w:top w:sz="4" w:val="single" w:color="BFBFBF"/>
+              <w:start w:sz="4" w:val="single" w:color="BFBFBF"/>
+              <w:bottom w:sz="4" w:val="single" w:color="BFBFBF"/>
+              <w:end w:sz="4" w:val="single" w:color="BFBFBF"/>
+            </w:tcBorders>
+          </w:tcPr>
+          <w:p>
+            <w:r/>
+            <w:r>
+              <w:rPr>
+                <w:rFonts w:ascii="Calibri" w:hAnsi="Calibri"/>
+                <w:b w:val="0"/>
+                <w:i w:val="0"/>
+                <w:sz w:val="20"/>
+              </w:rPr>
+              <w:t>Research Design</w:t>
+            </w:r>
+          </w:p>
+        </w:tc>
+        <w:tc>
+          <w:tcPr>
+            <w:tcW w:type="dxa" w:w="2160"/>
+            <w:shd w:fill="F2F2F2"/>
+            <w:tcBorders>
+              <w:top w:sz="4" w:val="single" w:color="BFBFBF"/>
+              <w:start w:sz="4" w:val="single" w:color="BFBFBF"/>
+              <w:bottom w:sz="4" w:val="single" w:color="BFBFBF"/>
+              <w:end w:sz="4" w:val="single" w:color="BFBFBF"/>
+            </w:tcBorders>
+          </w:tcPr>
+          <w:p>
+            <w:r/>
+            <w:r>
+              <w:rPr>
+                <w:rFonts w:ascii="Calibri" w:hAnsi="Calibri"/>
+                <w:b w:val="0"/>
+                <w:i w:val="0"/>
+                <w:sz w:val="20"/>
+              </w:rPr>
+              <w:t>20%</w:t>
+            </w:r>
+          </w:p>
+        </w:tc>
+        <w:tc>
+          <w:tcPr>
+            <w:tcW w:type="dxa" w:w="2160"/>
+            <w:shd w:fill="F2F2F2"/>
+            <w:tcBorders>
+              <w:top w:sz="4" w:val="single" w:color="BFBFBF"/>
+              <w:start w:sz="4" w:val="single" w:color="BFBFBF"/>
+              <w:bottom w:sz="4" w:val="single" w:color="BFBFBF"/>
+              <w:end w:sz="4" w:val="single" w:color="BFBFBF"/>
+            </w:tcBorders>
+          </w:tcPr>
+          <w:p>
+            <w:r/>
+            <w:r>
+              <w:rPr>
+                <w:rFonts w:ascii="Calibri" w:hAnsi="Calibri"/>
+                <w:b w:val="0"/>
+                <w:i w:val="0"/>
+                <w:sz w:val="20"/>
+              </w:rPr>
+              <w:t>Methodology fully specified with equations, hypotheses, and controls</w:t>
+            </w:r>
+          </w:p>
+        </w:tc>
+        <w:tc>
+          <w:tcPr>
+            <w:tcW w:type="dxa" w:w="2160"/>
+            <w:shd w:fill="F2F2F2"/>
+            <w:tcBorders>
+              <w:top w:sz="4" w:val="single" w:color="BFBFBF"/>
+              <w:start w:sz="4" w:val="single" w:color="BFBFBF"/>
+              <w:bottom w:sz="4" w:val="single" w:color="BFBFBF"/>
+              <w:end w:sz="4" w:val="single" w:color="BFBFBF"/>
+            </w:tcBorders>
+          </w:tcPr>
+          <w:p>
+            <w:r/>
+            <w:r>
+              <w:rPr>
+                <w:rFonts w:ascii="Calibri" w:hAnsi="Calibri"/>
+                <w:b w:val="0"/>
+                <w:i w:val="0"/>
+                <w:sz w:val="20"/>
+              </w:rPr>
+              <w:t>Add final validation details and any sensitivity outcomes</w:t>
+            </w:r>
+          </w:p>
+        </w:tc>
+      </w:tr>
+      <w:tr>
+        <w:tc>
+          <w:tcPr>
+            <w:tcW w:type="dxa" w:w="2160"/>
+            <w:shd w:fill="FFFFFF"/>
+            <w:tcBorders>
+              <w:top w:sz="4" w:val="single" w:color="BFBFBF"/>
+              <w:start w:sz="4" w:val="single" w:color="BFBFBF"/>
+              <w:bottom w:sz="4" w:val="single" w:color="BFBFBF"/>
+              <w:end w:sz="4" w:val="single" w:color="BFBFBF"/>
+            </w:tcBorders>
+          </w:tcPr>
+          <w:p>
+            <w:r/>
+            <w:r>
+              <w:rPr>
+                <w:rFonts w:ascii="Calibri" w:hAnsi="Calibri"/>
+                <w:b w:val="0"/>
+                <w:i w:val="0"/>
+                <w:sz w:val="20"/>
+              </w:rPr>
+              <w:t>Implementation (Practical Work)</w:t>
+            </w:r>
+          </w:p>
+        </w:tc>
+        <w:tc>
+          <w:tcPr>
+            <w:tcW w:type="dxa" w:w="2160"/>
+            <w:shd w:fill="FFFFFF"/>
+            <w:tcBorders>
+              <w:top w:sz="4" w:val="single" w:color="BFBFBF"/>
+              <w:start w:sz="4" w:val="single" w:color="BFBFBF"/>
+              <w:bottom w:sz="4" w:val="single" w:color="BFBFBF"/>
+              <w:end w:sz="4" w:val="single" w:color="BFBFBF"/>
+            </w:tcBorders>
+          </w:tcPr>
+          <w:p>
+            <w:r/>
+            <w:r>
+              <w:rPr>
+                <w:rFonts w:ascii="Calibri" w:hAnsi="Calibri"/>
+                <w:b w:val="0"/>
+                <w:i w:val="0"/>
+                <w:sz w:val="20"/>
+              </w:rPr>
+              <w:t>25%</w:t>
+            </w:r>
+          </w:p>
+        </w:tc>
+        <w:tc>
+          <w:tcPr>
+            <w:tcW w:type="dxa" w:w="2160"/>
+            <w:shd w:fill="FFFFFF"/>
+            <w:tcBorders>
+              <w:top w:sz="4" w:val="single" w:color="BFBFBF"/>
+              <w:start w:sz="4" w:val="single" w:color="BFBFBF"/>
+              <w:bottom w:sz="4" w:val="single" w:color="BFBFBF"/>
+              <w:end w:sz="4" w:val="single" w:color="BFBFBF"/>
+            </w:tcBorders>
+          </w:tcPr>
+          <w:p>
+            <w:r/>
+            <w:r>
+              <w:rPr>
+                <w:rFonts w:ascii="Calibri" w:hAnsi="Calibri"/>
+                <w:b w:val="0"/>
+                <w:i w:val="0"/>
+                <w:sz w:val="20"/>
+              </w:rPr>
+              <w:t>Core system completed (data pipeline, 4 models, FL, XAI, API)</w:t>
+            </w:r>
+          </w:p>
+        </w:tc>
+        <w:tc>
+          <w:tcPr>
+            <w:tcW w:type="dxa" w:w="2160"/>
+            <w:shd w:fill="FFFFFF"/>
+            <w:tcBorders>
+              <w:top w:sz="4" w:val="single" w:color="BFBFBF"/>
+              <w:start w:sz="4" w:val="single" w:color="BFBFBF"/>
+              <w:bottom w:sz="4" w:val="single" w:color="BFBFBF"/>
+              <w:end w:sz="4" w:val="single" w:color="BFBFBF"/>
+            </w:tcBorders>
+          </w:tcPr>
+          <w:p>
+            <w:r/>
+            <w:r>
+              <w:rPr>
+                <w:rFonts w:ascii="Calibri" w:hAnsi="Calibri"/>
+                <w:b w:val="0"/>
+                <w:i w:val="0"/>
+                <w:sz w:val="20"/>
+              </w:rPr>
+              <w:t>Improve code documentation and reproducibility notes</w:t>
+            </w:r>
+          </w:p>
+        </w:tc>
+      </w:tr>
+      <w:tr>
+        <w:tc>
+          <w:tcPr>
+            <w:tcW w:type="dxa" w:w="2160"/>
+            <w:shd w:fill="F2F2F2"/>
+            <w:tcBorders>
+              <w:top w:sz="4" w:val="single" w:color="BFBFBF"/>
+              <w:start w:sz="4" w:val="single" w:color="BFBFBF"/>
+              <w:bottom w:sz="4" w:val="single" w:color="BFBFBF"/>
+              <w:end w:sz="4" w:val="single" w:color="BFBFBF"/>
+            </w:tcBorders>
+          </w:tcPr>
+          <w:p>
+            <w:r/>
+            <w:r>
+              <w:rPr>
+                <w:rFonts w:ascii="Calibri" w:hAnsi="Calibri"/>
+                <w:b w:val="0"/>
+                <w:i w:val="0"/>
+                <w:sz w:val="20"/>
+              </w:rPr>
+              <w:t>Evaluation</w:t>
+            </w:r>
+          </w:p>
+        </w:tc>
+        <w:tc>
+          <w:tcPr>
+            <w:tcW w:type="dxa" w:w="2160"/>
+            <w:shd w:fill="F2F2F2"/>
+            <w:tcBorders>
+              <w:top w:sz="4" w:val="single" w:color="BFBFBF"/>
+              <w:start w:sz="4" w:val="single" w:color="BFBFBF"/>
+              <w:bottom w:sz="4" w:val="single" w:color="BFBFBF"/>
+              <w:end w:sz="4" w:val="single" w:color="BFBFBF"/>
+            </w:tcBorders>
+          </w:tcPr>
+          <w:p>
+            <w:r/>
+            <w:r>
+              <w:rPr>
+                <w:rFonts w:ascii="Calibri" w:hAnsi="Calibri"/>
+                <w:b w:val="0"/>
+                <w:i w:val="0"/>
+                <w:sz w:val="20"/>
+              </w:rPr>
+              <w:t>5%</w:t>
+            </w:r>
+          </w:p>
+        </w:tc>
+        <w:tc>
+          <w:tcPr>
+            <w:tcW w:type="dxa" w:w="2160"/>
+            <w:shd w:fill="F2F2F2"/>
+            <w:tcBorders>
+              <w:top w:sz="4" w:val="single" w:color="BFBFBF"/>
+              <w:start w:sz="4" w:val="single" w:color="BFBFBF"/>
+              <w:bottom w:sz="4" w:val="single" w:color="BFBFBF"/>
+              <w:end w:sz="4" w:val="single" w:color="BFBFBF"/>
+            </w:tcBorders>
+          </w:tcPr>
+          <w:p>
+            <w:r/>
+            <w:r>
+              <w:rPr>
+                <w:rFonts w:ascii="Calibri" w:hAnsi="Calibri"/>
+                <w:b w:val="0"/>
+                <w:i w:val="0"/>
+                <w:sz w:val="20"/>
+              </w:rPr>
+              <w:t>Preliminary metrics collected</w:t>
+            </w:r>
+          </w:p>
+        </w:tc>
+        <w:tc>
+          <w:tcPr>
+            <w:tcW w:type="dxa" w:w="2160"/>
+            <w:shd w:fill="F2F2F2"/>
+            <w:tcBorders>
+              <w:top w:sz="4" w:val="single" w:color="BFBFBF"/>
+              <w:start w:sz="4" w:val="single" w:color="BFBFBF"/>
+              <w:bottom w:sz="4" w:val="single" w:color="BFBFBF"/>
+              <w:end w:sz="4" w:val="single" w:color="BFBFBF"/>
+            </w:tcBorders>
+          </w:tcPr>
+          <w:p>
+            <w:r/>
+            <w:r>
+              <w:rPr>
+                <w:rFonts w:ascii="Calibri" w:hAnsi="Calibri"/>
+                <w:b w:val="0"/>
+                <w:i w:val="0"/>
+                <w:sz w:val="20"/>
+              </w:rPr>
+              <w:t>Run final fixed-seed experiments and verify consistency</w:t>
+            </w:r>
+          </w:p>
+        </w:tc>
+      </w:tr>
+      <w:tr>
+        <w:tc>
+          <w:tcPr>
+            <w:tcW w:type="dxa" w:w="2160"/>
+            <w:shd w:fill="FFFFFF"/>
+            <w:tcBorders>
+              <w:top w:sz="4" w:val="single" w:color="BFBFBF"/>
+              <w:start w:sz="4" w:val="single" w:color="BFBFBF"/>
+              <w:bottom w:sz="4" w:val="single" w:color="BFBFBF"/>
+              <w:end w:sz="4" w:val="single" w:color="BFBFBF"/>
+            </w:tcBorders>
+          </w:tcPr>
+          <w:p>
+            <w:r/>
+            <w:r>
+              <w:rPr>
+                <w:rFonts w:ascii="Calibri" w:hAnsi="Calibri"/>
+                <w:b w:val="0"/>
+                <w:i w:val="0"/>
+                <w:sz w:val="20"/>
+              </w:rPr>
+              <w:t>Presentation of Results</w:t>
+            </w:r>
+          </w:p>
+        </w:tc>
+        <w:tc>
+          <w:tcPr>
+            <w:tcW w:type="dxa" w:w="2160"/>
+            <w:shd w:fill="FFFFFF"/>
+            <w:tcBorders>
+              <w:top w:sz="4" w:val="single" w:color="BFBFBF"/>
+              <w:start w:sz="4" w:val="single" w:color="BFBFBF"/>
+              <w:bottom w:sz="4" w:val="single" w:color="BFBFBF"/>
+              <w:end w:sz="4" w:val="single" w:color="BFBFBF"/>
+            </w:tcBorders>
+          </w:tcPr>
+          <w:p>
+            <w:r/>
+            <w:r>
+              <w:rPr>
+                <w:rFonts w:ascii="Calibri" w:hAnsi="Calibri"/>
+                <w:b w:val="0"/>
+                <w:i w:val="0"/>
+                <w:sz w:val="20"/>
+              </w:rPr>
+              <w:t>5%</w:t>
+            </w:r>
+          </w:p>
+        </w:tc>
+        <w:tc>
+          <w:tcPr>
+            <w:tcW w:type="dxa" w:w="2160"/>
+            <w:shd w:fill="FFFFFF"/>
+            <w:tcBorders>
+              <w:top w:sz="4" w:val="single" w:color="BFBFBF"/>
+              <w:start w:sz="4" w:val="single" w:color="BFBFBF"/>
+              <w:bottom w:sz="4" w:val="single" w:color="BFBFBF"/>
+              <w:end w:sz="4" w:val="single" w:color="BFBFBF"/>
+            </w:tcBorders>
+          </w:tcPr>
+          <w:p>
+            <w:r/>
+            <w:r>
+              <w:rPr>
+                <w:rFonts w:ascii="Calibri" w:hAnsi="Calibri"/>
+                <w:b w:val="0"/>
+                <w:i w:val="0"/>
+                <w:sz w:val="20"/>
+              </w:rPr>
+              <w:t>Result plan and figure templates prepared</w:t>
+            </w:r>
+          </w:p>
+        </w:tc>
+        <w:tc>
+          <w:tcPr>
+            <w:tcW w:type="dxa" w:w="2160"/>
+            <w:shd w:fill="FFFFFF"/>
+            <w:tcBorders>
+              <w:top w:sz="4" w:val="single" w:color="BFBFBF"/>
+              <w:start w:sz="4" w:val="single" w:color="BFBFBF"/>
+              <w:bottom w:sz="4" w:val="single" w:color="BFBFBF"/>
+              <w:end w:sz="4" w:val="single" w:color="BFBFBF"/>
+            </w:tcBorders>
+          </w:tcPr>
+          <w:p>
+            <w:r/>
+            <w:r>
+              <w:rPr>
+                <w:rFonts w:ascii="Calibri" w:hAnsi="Calibri"/>
+                <w:b w:val="0"/>
+                <w:i w:val="0"/>
+                <w:sz w:val="20"/>
+              </w:rPr>
+              <w:t>Insert final tables/plots with concise interpretation</w:t>
+            </w:r>
+          </w:p>
+        </w:tc>
+      </w:tr>
+      <w:tr>
+        <w:tc>
+          <w:tcPr>
+            <w:tcW w:type="dxa" w:w="2160"/>
+            <w:shd w:fill="F2F2F2"/>
+            <w:tcBorders>
+              <w:top w:sz="4" w:val="single" w:color="BFBFBF"/>
+              <w:start w:sz="4" w:val="single" w:color="BFBFBF"/>
+              <w:bottom w:sz="4" w:val="single" w:color="BFBFBF"/>
+              <w:end w:sz="4" w:val="single" w:color="BFBFBF"/>
+            </w:tcBorders>
+          </w:tcPr>
+          <w:p>
+            <w:r/>
+            <w:r>
+              <w:rPr>
+                <w:rFonts w:ascii="Calibri" w:hAnsi="Calibri"/>
+                <w:b w:val="0"/>
+                <w:i w:val="0"/>
+                <w:sz w:val="20"/>
+              </w:rPr>
+              <w:t>Conclusions and Recommendations</w:t>
+            </w:r>
+          </w:p>
+        </w:tc>
+        <w:tc>
+          <w:tcPr>
+            <w:tcW w:type="dxa" w:w="2160"/>
+            <w:shd w:fill="F2F2F2"/>
+            <w:tcBorders>
+              <w:top w:sz="4" w:val="single" w:color="BFBFBF"/>
+              <w:start w:sz="4" w:val="single" w:color="BFBFBF"/>
+              <w:bottom w:sz="4" w:val="single" w:color="BFBFBF"/>
+              <w:end w:sz="4" w:val="single" w:color="BFBFBF"/>
+            </w:tcBorders>
+          </w:tcPr>
+          <w:p>
+            <w:r/>
+            <w:r>
+              <w:rPr>
+                <w:rFonts w:ascii="Calibri" w:hAnsi="Calibri"/>
+                <w:b w:val="0"/>
+                <w:i w:val="0"/>
+                <w:sz w:val="20"/>
+              </w:rPr>
+              <w:t>10%</w:t>
+            </w:r>
+          </w:p>
+        </w:tc>
+        <w:tc>
+          <w:tcPr>
+            <w:tcW w:type="dxa" w:w="2160"/>
+            <w:shd w:fill="F2F2F2"/>
+            <w:tcBorders>
+              <w:top w:sz="4" w:val="single" w:color="BFBFBF"/>
+              <w:start w:sz="4" w:val="single" w:color="BFBFBF"/>
+              <w:bottom w:sz="4" w:val="single" w:color="BFBFBF"/>
+              <w:end w:sz="4" w:val="single" w:color="BFBFBF"/>
+            </w:tcBorders>
+          </w:tcPr>
+          <w:p>
+            <w:r/>
+            <w:r>
+              <w:rPr>
+                <w:rFonts w:ascii="Calibri" w:hAnsi="Calibri"/>
+                <w:b w:val="0"/>
+                <w:i w:val="0"/>
+                <w:sz w:val="20"/>
+              </w:rPr>
+              <w:t>Draft direction defined in completion plan</w:t>
+            </w:r>
+          </w:p>
+        </w:tc>
+        <w:tc>
+          <w:tcPr>
+            <w:tcW w:type="dxa" w:w="2160"/>
+            <w:shd w:fill="F2F2F2"/>
+            <w:tcBorders>
+              <w:top w:sz="4" w:val="single" w:color="BFBFBF"/>
+              <w:start w:sz="4" w:val="single" w:color="BFBFBF"/>
+              <w:bottom w:sz="4" w:val="single" w:color="BFBFBF"/>
+              <w:end w:sz="4" w:val="single" w:color="BFBFBF"/>
+            </w:tcBorders>
+          </w:tcPr>
+          <w:p>
+            <w:r/>
+            <w:r>
+              <w:rPr>
+                <w:rFonts w:ascii="Calibri" w:hAnsi="Calibri"/>
+                <w:b w:val="0"/>
+                <w:i w:val="0"/>
+                <w:sz w:val="20"/>
+              </w:rPr>
+              <w:t>Finalise evidence-based recommendations from results</w:t>
+            </w:r>
+          </w:p>
+        </w:tc>
+      </w:tr>
+      <w:tr>
+        <w:tc>
+          <w:tcPr>
+            <w:tcW w:type="dxa" w:w="2160"/>
+            <w:shd w:fill="FFFFFF"/>
+            <w:tcBorders>
+              <w:top w:sz="4" w:val="single" w:color="BFBFBF"/>
+              <w:start w:sz="4" w:val="single" w:color="BFBFBF"/>
+              <w:bottom w:sz="4" w:val="single" w:color="BFBFBF"/>
+              <w:end w:sz="4" w:val="single" w:color="BFBFBF"/>
+            </w:tcBorders>
+          </w:tcPr>
+          <w:p>
+            <w:r/>
+            <w:r>
+              <w:rPr>
+                <w:rFonts w:ascii="Calibri" w:hAnsi="Calibri"/>
+                <w:b w:val="0"/>
+                <w:i w:val="0"/>
+                <w:sz w:val="20"/>
+              </w:rPr>
+              <w:t>Critical Self-Evaluation</w:t>
+            </w:r>
+          </w:p>
+        </w:tc>
+        <w:tc>
+          <w:tcPr>
+            <w:tcW w:type="dxa" w:w="2160"/>
+            <w:shd w:fill="FFFFFF"/>
+            <w:tcBorders>
+              <w:top w:sz="4" w:val="single" w:color="BFBFBF"/>
+              <w:start w:sz="4" w:val="single" w:color="BFBFBF"/>
+              <w:bottom w:sz="4" w:val="single" w:color="BFBFBF"/>
+              <w:end w:sz="4" w:val="single" w:color="BFBFBF"/>
+            </w:tcBorders>
+          </w:tcPr>
+          <w:p>
+            <w:r/>
+            <w:r>
+              <w:rPr>
+                <w:rFonts w:ascii="Calibri" w:hAnsi="Calibri"/>
+                <w:b w:val="0"/>
+                <w:i w:val="0"/>
+                <w:sz w:val="20"/>
+              </w:rPr>
+              <w:t>10%</w:t>
+            </w:r>
+          </w:p>
+        </w:tc>
+        <w:tc>
+          <w:tcPr>
+            <w:tcW w:type="dxa" w:w="2160"/>
+            <w:shd w:fill="FFFFFF"/>
+            <w:tcBorders>
+              <w:top w:sz="4" w:val="single" w:color="BFBFBF"/>
+              <w:start w:sz="4" w:val="single" w:color="BFBFBF"/>
+              <w:bottom w:sz="4" w:val="single" w:color="BFBFBF"/>
+              <w:end w:sz="4" w:val="single" w:color="BFBFBF"/>
+            </w:tcBorders>
+          </w:tcPr>
+          <w:p>
+            <w:r/>
+            <w:r>
+              <w:rPr>
+                <w:rFonts w:ascii="Calibri" w:hAnsi="Calibri"/>
+                <w:b w:val="0"/>
+                <w:i w:val="0"/>
+                <w:sz w:val="20"/>
+              </w:rPr>
+              <w:t>Anticipated reflection areas identified</w:t>
+            </w:r>
+          </w:p>
+        </w:tc>
+        <w:tc>
+          <w:tcPr>
+            <w:tcW w:type="dxa" w:w="2160"/>
+            <w:shd w:fill="FFFFFF"/>
+            <w:tcBorders>
+              <w:top w:sz="4" w:val="single" w:color="BFBFBF"/>
+              <w:start w:sz="4" w:val="single" w:color="BFBFBF"/>
+              <w:bottom w:sz="4" w:val="single" w:color="BFBFBF"/>
+              <w:end w:sz="4" w:val="single" w:color="BFBFBF"/>
+            </w:tcBorders>
+          </w:tcPr>
+          <w:p>
+            <w:r/>
+            <w:r>
+              <w:rPr>
+                <w:rFonts w:ascii="Calibri" w:hAnsi="Calibri"/>
+                <w:b w:val="0"/>
+                <w:i w:val="0"/>
+                <w:sz w:val="20"/>
+              </w:rPr>
+              <w:t>Write full reflective analysis after final evaluation</w:t>
+            </w:r>
+          </w:p>
+        </w:tc>
+      </w:tr>
+    </w:tbl>
+    <w:p>
       <w:pPr>
         <w:pStyle w:val="Heading2"/>
       </w:pPr>

</xml_diff>